<commit_message>
Add main OR solver launcher
</commit_message>
<xml_diff>
--- a/Git Help.docx
+++ b/Git Help.docx
@@ -2,6 +2,222 @@
 <file path=word/document.xml><?xml version="1.0" encoding="utf-8"?>
 <w:document xmlns:wpc="http://schemas.microsoft.com/office/word/2010/wordprocessingCanvas" xmlns:cx="http://schemas.microsoft.com/office/drawing/2014/chartex" xmlns:cx1="http://schemas.microsoft.com/office/drawing/2015/9/8/chartex" xmlns:cx2="http://schemas.microsoft.com/office/drawing/2015/10/21/chartex" xmlns:cx3="http://schemas.microsoft.com/office/drawing/2016/5/9/chartex" xmlns:cx4="http://schemas.microsoft.com/office/drawing/2016/5/10/chartex" xmlns:cx5="http://schemas.microsoft.com/office/drawing/2016/5/11/chartex" xmlns:cx6="http://schemas.microsoft.com/office/drawing/2016/5/12/chartex" xmlns:cx7="http://schemas.microsoft.com/office/drawing/2016/5/13/chartex" xmlns:cx8="http://schemas.microsoft.com/office/drawing/2016/5/14/chartex" xmlns:mc="http://schemas.openxmlformats.org/markup-compatibility/2006" xmlns:aink="http://schemas.microsoft.com/office/drawing/2016/ink" xmlns:am3d="http://schemas.microsoft.com/office/drawing/2017/model3d" xmlns:o="urn:schemas-microsoft-com:office:office" xmlns:oel="http://schemas.microsoft.com/office/2019/extlst" xmlns:r="http://schemas.openxmlformats.org/officeDocument/2006/relationships" xmlns:m="http://schemas.openxmlformats.org/officeDocument/2006/math" xmlns:v="urn:schemas-microsoft-com:vml" xmlns:wp14="http://schemas.microsoft.com/office/word/2010/wordprocessingDrawing" xmlns:wp="http://schemas.openxmlformats.org/drawingml/2006/wordprocessingDrawing" xmlns:w10="urn:schemas-microsoft-com:office:word" xmlns:w="http://schemas.openxmlformats.org/wordprocessingml/2006/main" xmlns:w14="http://schemas.microsoft.com/office/word/2010/wordml" xmlns:w15="http://schemas.microsoft.com/office/word/2012/wordml" xmlns:w16cex="http://schemas.microsoft.com/office/word/2018/wordml/cex" xmlns:w16cid="http://schemas.microsoft.com/office/word/2016/wordml/cid" xmlns:w16="http://schemas.microsoft.com/office/word/2018/wordml" xmlns:w16sdtdh="http://schemas.microsoft.com/office/word/2020/wordml/sdtdatahash" xmlns:w16se="http://schemas.microsoft.com/office/word/2015/wordml/symex" xmlns:wpg="http://schemas.microsoft.com/office/word/2010/wordprocessingGroup" xmlns:wpi="http://schemas.microsoft.com/office/word/2010/wordprocessingInk" xmlns:wne="http://schemas.microsoft.com/office/word/2006/wordml" xmlns:wps="http://schemas.microsoft.com/office/word/2010/wordprocessingShape" mc:Ignorable="w14 w15 w16se w16cid w16 w16cex w16sdtdh wp14">
   <w:body>
+    <w:p>
+      <w:pPr>
+        <w:bidi/>
+        <w:spacing w:before="100" w:beforeAutospacing="1" w:after="100" w:afterAutospacing="1" w:line="240" w:lineRule="auto"/>
+        <w:rPr>
+          <w:rFonts w:ascii="Times New Roman" w:eastAsia="Times New Roman" w:hAnsi="Times New Roman" w:cs="Times New Roman"/>
+          <w:kern w:val="0"/>
+          <w:highlight w:val="yellow"/>
+          <w14:ligatures w14:val="none"/>
+        </w:rPr>
+      </w:pPr>
+      <w:r>
+        <w:rPr>
+          <w:rFonts w:ascii="Times New Roman" w:eastAsia="Times New Roman" w:hAnsi="Times New Roman" w:cs="Times New Roman"/>
+          <w:kern w:val="0"/>
+          <w:rtl/>
+          <w14:ligatures w14:val="none"/>
+        </w:rPr>
+        <w:t xml:space="preserve">از این </w:t>
+      </w:r>
+      <w:r>
+        <w:rPr>
+          <w:rFonts w:ascii="Times New Roman" w:eastAsia="Times New Roman" w:hAnsi="Times New Roman" w:cs="Times New Roman"/>
+          <w:kern w:val="0"/>
+          <w:highlight w:val="yellow"/>
+          <w:rtl/>
+          <w14:ligatures w14:val="none"/>
+        </w:rPr>
+        <w:t>به بعد هر بار تغییر دادی</w:t>
+      </w:r>
+      <w:r>
+        <w:rPr>
+          <w:rFonts w:ascii="Times New Roman" w:eastAsia="Times New Roman" w:hAnsi="Times New Roman" w:cs="Times New Roman"/>
+          <w:kern w:val="0"/>
+          <w:highlight w:val="yellow"/>
+          <w14:ligatures w14:val="none"/>
+        </w:rPr>
+        <w:t>:</w:t>
+      </w:r>
+    </w:p>
+    <w:p>
+      <w:pPr>
+        <w:bidi/>
+        <w:spacing w:before="100" w:beforeAutospacing="1" w:after="100" w:afterAutospacing="1" w:line="240" w:lineRule="auto"/>
+        <w:rPr>
+          <w:rFonts w:ascii="Times New Roman" w:eastAsia="Times New Roman" w:hAnsi="Times New Roman" w:cs="Times New Roman"/>
+          <w:kern w:val="0"/>
+          <w:highlight w:val="yellow"/>
+          <w14:ligatures w14:val="none"/>
+        </w:rPr>
+      </w:pPr>
+      <w:r>
+        <w:rPr>
+          <w:rFonts w:ascii="Times New Roman" w:eastAsia="Times New Roman" w:hAnsi="Times New Roman" w:cs="Times New Roman"/>
+          <w:kern w:val="0"/>
+          <w:highlight w:val="yellow"/>
+          <w14:ligatures w14:val="none"/>
+        </w:rPr>
+        <w:t>git status</w:t>
+      </w:r>
+      <w:r>
+        <w:rPr>
+          <w:rFonts w:ascii="Times New Roman" w:eastAsia="Times New Roman" w:hAnsi="Times New Roman" w:cs="Times New Roman"/>
+          <w:kern w:val="0"/>
+          <w:highlight w:val="yellow"/>
+          <w14:ligatures w14:val="none"/>
+        </w:rPr>
+        <w:br/>
+        <w:t xml:space="preserve">git </w:t>
+      </w:r>
+      <w:proofErr w:type="gramStart"/>
+      <w:r>
+        <w:rPr>
+          <w:rFonts w:ascii="Times New Roman" w:eastAsia="Times New Roman" w:hAnsi="Times New Roman" w:cs="Times New Roman"/>
+          <w:kern w:val="0"/>
+          <w:highlight w:val="yellow"/>
+          <w14:ligatures w14:val="none"/>
+        </w:rPr>
+        <w:t>add .</w:t>
+      </w:r>
+      <w:proofErr w:type="gramEnd"/>
+      <w:r>
+        <w:rPr>
+          <w:rFonts w:ascii="Times New Roman" w:eastAsia="Times New Roman" w:hAnsi="Times New Roman" w:cs="Times New Roman"/>
+          <w:kern w:val="0"/>
+          <w:highlight w:val="yellow"/>
+          <w14:ligatures w14:val="none"/>
+        </w:rPr>
+        <w:br/>
+        <w:t>git commit -m "</w:t>
+      </w:r>
+      <w:r>
+        <w:rPr>
+          <w:rFonts w:ascii="Times New Roman" w:eastAsia="Times New Roman" w:hAnsi="Times New Roman" w:cs="Times New Roman"/>
+          <w:kern w:val="0"/>
+          <w:highlight w:val="yellow"/>
+          <w:rtl/>
+          <w14:ligatures w14:val="none"/>
+        </w:rPr>
+        <w:t>توضیح کوتاه تغییرات</w:t>
+      </w:r>
+      <w:r>
+        <w:rPr>
+          <w:rFonts w:ascii="Times New Roman" w:eastAsia="Times New Roman" w:hAnsi="Times New Roman" w:cs="Times New Roman"/>
+          <w:kern w:val="0"/>
+          <w:highlight w:val="yellow"/>
+          <w14:ligatures w14:val="none"/>
+        </w:rPr>
+        <w:t>"</w:t>
+      </w:r>
+      <w:r>
+        <w:rPr>
+          <w:rFonts w:ascii="Times New Roman" w:eastAsia="Times New Roman" w:hAnsi="Times New Roman" w:cs="Times New Roman"/>
+          <w:kern w:val="0"/>
+          <w:highlight w:val="yellow"/>
+          <w14:ligatures w14:val="none"/>
+        </w:rPr>
+        <w:br/>
+        <w:t>git push</w:t>
+      </w:r>
+    </w:p>
+    <w:p>
+      <w:pPr>
+        <w:bidi/>
+        <w:spacing w:before="100" w:beforeAutospacing="1" w:after="100" w:afterAutospacing="1" w:line="240" w:lineRule="auto"/>
+        <w:rPr>
+          <w:rFonts w:ascii="Times New Roman" w:eastAsia="Times New Roman" w:hAnsi="Times New Roman" w:cs="Times New Roman"/>
+          <w:kern w:val="0"/>
+          <w:highlight w:val="yellow"/>
+          <w14:ligatures w14:val="none"/>
+        </w:rPr>
+      </w:pPr>
+      <w:r>
+        <w:rPr>
+          <w:rFonts w:ascii="Times New Roman" w:eastAsia="Times New Roman" w:hAnsi="Times New Roman" w:cs="Times New Roman"/>
+          <w:kern w:val="0"/>
+          <w:highlight w:val="yellow"/>
+          <w:rtl/>
+          <w14:ligatures w14:val="none"/>
+        </w:rPr>
+        <w:t>پروژه‌ات الان اینجاست</w:t>
+      </w:r>
+      <w:r>
+        <w:rPr>
+          <w:rFonts w:ascii="Times New Roman" w:eastAsia="Times New Roman" w:hAnsi="Times New Roman" w:cs="Times New Roman"/>
+          <w:kern w:val="0"/>
+          <w:highlight w:val="yellow"/>
+          <w14:ligatures w14:val="none"/>
+        </w:rPr>
+        <w:t>:</w:t>
+      </w:r>
+    </w:p>
+    <w:p>
+      <w:pPr>
+        <w:bidi/>
+        <w:spacing w:before="100" w:beforeAutospacing="1" w:after="100" w:afterAutospacing="1" w:line="240" w:lineRule="auto"/>
+        <w:rPr>
+          <w:rFonts w:ascii="Times New Roman" w:eastAsia="Times New Roman" w:hAnsi="Times New Roman" w:cs="Times New Roman"/>
+          <w:kern w:val="0"/>
+          <w14:ligatures w14:val="none"/>
+        </w:rPr>
+      </w:pPr>
+      <w:r>
+        <w:rPr>
+          <w:rFonts w:ascii="Times New Roman" w:eastAsia="Times New Roman" w:hAnsi="Times New Roman" w:cs="Times New Roman"/>
+          <w:kern w:val="0"/>
+          <w:highlight w:val="yellow"/>
+          <w14:ligatures w14:val="none"/>
+        </w:rPr>
+        <w:t>https://github.com/navidnaderpour/Navid_OR_Solver</w:t>
+      </w:r>
+    </w:p>
+    <w:p>
+      <w:pPr>
+        <w:bidi/>
+        <w:spacing w:before="100" w:beforeAutospacing="1" w:after="100" w:afterAutospacing="1" w:line="240" w:lineRule="auto"/>
+        <w:rPr>
+          <w:rFonts w:ascii="Times New Roman" w:eastAsia="Times New Roman" w:hAnsi="Times New Roman" w:cs="Times New Roman"/>
+          <w:kern w:val="0"/>
+          <w14:ligatures w14:val="none"/>
+        </w:rPr>
+      </w:pPr>
+    </w:p>
+    <w:p>
+      <w:pPr>
+        <w:bidi/>
+        <w:spacing w:before="100" w:beforeAutospacing="1" w:after="100" w:afterAutospacing="1" w:line="240" w:lineRule="auto"/>
+        <w:rPr>
+          <w:rFonts w:ascii="Times New Roman" w:eastAsia="Times New Roman" w:hAnsi="Times New Roman" w:cs="Times New Roman"/>
+          <w:kern w:val="0"/>
+          <w14:ligatures w14:val="none"/>
+        </w:rPr>
+      </w:pPr>
+    </w:p>
+    <w:p>
+      <w:pPr>
+        <w:bidi/>
+        <w:spacing w:before="100" w:beforeAutospacing="1" w:after="100" w:afterAutospacing="1" w:line="240" w:lineRule="auto"/>
+        <w:rPr>
+          <w:rFonts w:ascii="Times New Roman" w:eastAsia="Times New Roman" w:hAnsi="Times New Roman" w:cs="Times New Roman"/>
+          <w:kern w:val="0"/>
+          <w14:ligatures w14:val="none"/>
+        </w:rPr>
+      </w:pPr>
+    </w:p>
+    <w:p>
+      <w:pPr>
+        <w:bidi/>
+        <w:spacing w:before="100" w:beforeAutospacing="1" w:after="100" w:afterAutospacing="1" w:line="240" w:lineRule="auto"/>
+        <w:rPr>
+          <w:rFonts w:ascii="Times New Roman" w:eastAsia="Times New Roman" w:hAnsi="Times New Roman" w:cs="Times New Roman"/>
+          <w:kern w:val="0"/>
+          <w14:ligatures w14:val="none"/>
+        </w:rPr>
+      </w:pPr>
+    </w:p>
     <w:p>
       <w:pPr>
         <w:bidi/>
@@ -738,6 +954,7 @@
           <w:szCs w:val="20"/>
           <w14:ligatures w14:val="none"/>
         </w:rPr>
+        <w:lastRenderedPageBreak/>
         <w:t>git status</w:t>
       </w:r>
     </w:p>
@@ -1082,7 +1299,6 @@
           <w:szCs w:val="20"/>
           <w14:ligatures w14:val="none"/>
         </w:rPr>
-        <w:lastRenderedPageBreak/>
         <w:t>git push</w:t>
       </w:r>
     </w:p>
@@ -1871,7 +2087,6 @@
           <w:szCs w:val="27"/>
           <w14:ligatures w14:val="none"/>
         </w:rPr>
-        <w:lastRenderedPageBreak/>
         <w:t>1. Repository name</w:t>
       </w:r>
     </w:p>
@@ -2382,6 +2597,7 @@
           <w:szCs w:val="20"/>
           <w14:ligatures w14:val="none"/>
         </w:rPr>
+        <w:lastRenderedPageBreak/>
         <w:t>☐</w:t>
       </w:r>
       <w:r>
@@ -2770,7 +2986,6 @@
           <w:szCs w:val="20"/>
           <w14:ligatures w14:val="none"/>
         </w:rPr>
-        <w:lastRenderedPageBreak/>
         <w:t>git remote add origin https://github.com/navidnaderpour/Navid_OR_Solver.git</w:t>
       </w:r>
       <w:r>
@@ -4856,7 +5071,7 @@
           <w:lang w:bidi="fa-IR"/>
         </w:rPr>
         <w:pict w14:anchorId="5A64AE66">
-          <v:rect id="_x0000_i1113" style="width:0;height:1.5pt" o:hralign="center" o:hrstd="t" o:hr="t" fillcolor="#a0a0a0" stroked="f"/>
+          <v:rect id="_x0000_i1039" style="width:0;height:1.5pt" o:hralign="center" o:hrstd="t" o:hr="t" fillcolor="#a0a0a0" stroked="f"/>
         </w:pict>
       </w:r>
     </w:p>
@@ -5135,7 +5350,7 @@
           <w:lang w:bidi="fa-IR"/>
         </w:rPr>
         <w:pict w14:anchorId="6383531F">
-          <v:rect id="_x0000_i1114" style="width:0;height:1.5pt" o:hralign="center" o:hrstd="t" o:hr="t" fillcolor="#a0a0a0" stroked="f"/>
+          <v:rect id="_x0000_i1040" style="width:0;height:1.5pt" o:hralign="center" o:hrstd="t" o:hr="t" fillcolor="#a0a0a0" stroked="f"/>
         </w:pict>
       </w:r>
     </w:p>
@@ -5232,7 +5447,7 @@
           <w:lang w:bidi="fa-IR"/>
         </w:rPr>
         <w:pict w14:anchorId="4018C4D2">
-          <v:rect id="_x0000_i1115" style="width:0;height:1.5pt" o:hralign="center" o:hrstd="t" o:hr="t" fillcolor="#a0a0a0" stroked="f"/>
+          <v:rect id="_x0000_i1041" style="width:0;height:1.5pt" o:hralign="center" o:hrstd="t" o:hr="t" fillcolor="#a0a0a0" stroked="f"/>
         </w:pict>
       </w:r>
     </w:p>
@@ -5363,7 +5578,7 @@
           <w:lang w:bidi="fa-IR"/>
         </w:rPr>
         <w:pict w14:anchorId="11439019">
-          <v:rect id="_x0000_i1116" style="width:0;height:1.5pt" o:hralign="center" o:hrstd="t" o:hr="t" fillcolor="#a0a0a0" stroked="f"/>
+          <v:rect id="_x0000_i1042" style="width:0;height:1.5pt" o:hralign="center" o:hrstd="t" o:hr="t" fillcolor="#a0a0a0" stroked="f"/>
         </w:pict>
       </w:r>
     </w:p>
@@ -5457,7 +5672,7 @@
           <w:lang w:bidi="fa-IR"/>
         </w:rPr>
         <w:pict w14:anchorId="67FBC075">
-          <v:rect id="_x0000_i1117" style="width:0;height:1.5pt" o:hralign="center" o:hrstd="t" o:hr="t" fillcolor="#a0a0a0" stroked="f"/>
+          <v:rect id="_x0000_i1043" style="width:0;height:1.5pt" o:hralign="center" o:hrstd="t" o:hr="t" fillcolor="#a0a0a0" stroked="f"/>
         </w:pict>
       </w:r>
     </w:p>
@@ -5514,7 +5729,7 @@
         </w:rPr>
         <w:lastRenderedPageBreak/>
         <w:pict w14:anchorId="40133D3E">
-          <v:rect id="_x0000_i1118" style="width:0;height:1.5pt" o:hralign="center" o:hrstd="t" o:hr="t" fillcolor="#a0a0a0" stroked="f"/>
+          <v:rect id="_x0000_i1044" style="width:0;height:1.5pt" o:hralign="center" o:hrstd="t" o:hr="t" fillcolor="#a0a0a0" stroked="f"/>
         </w:pict>
       </w:r>
     </w:p>
@@ -5597,7 +5812,7 @@
           <w:lang w:bidi="fa-IR"/>
         </w:rPr>
         <w:pict w14:anchorId="3D214D37">
-          <v:rect id="_x0000_i1119" style="width:0;height:1.5pt" o:hralign="center" o:hrstd="t" o:hr="t" fillcolor="#a0a0a0" stroked="f"/>
+          <v:rect id="_x0000_i1045" style="width:0;height:1.5pt" o:hralign="center" o:hrstd="t" o:hr="t" fillcolor="#a0a0a0" stroked="f"/>
         </w:pict>
       </w:r>
     </w:p>
@@ -5670,7 +5885,7 @@
           <w:lang w:bidi="fa-IR"/>
         </w:rPr>
         <w:pict w14:anchorId="419BFAB7">
-          <v:rect id="_x0000_i1120" style="width:0;height:1.5pt" o:hralign="center" o:hrstd="t" o:hr="t" fillcolor="#a0a0a0" stroked="f"/>
+          <v:rect id="_x0000_i1046" style="width:0;height:1.5pt" o:hralign="center" o:hrstd="t" o:hr="t" fillcolor="#a0a0a0" stroked="f"/>
         </w:pict>
       </w:r>
     </w:p>
@@ -5748,7 +5963,7 @@
           <w:lang w:bidi="fa-IR"/>
         </w:rPr>
         <w:pict w14:anchorId="17EE201D">
-          <v:rect id="_x0000_i1121" style="width:0;height:1.5pt" o:hralign="center" o:hrstd="t" o:hr="t" fillcolor="#a0a0a0" stroked="f"/>
+          <v:rect id="_x0000_i1047" style="width:0;height:1.5pt" o:hralign="center" o:hrstd="t" o:hr="t" fillcolor="#a0a0a0" stroked="f"/>
         </w:pict>
       </w:r>
     </w:p>
@@ -5860,7 +6075,7 @@
           <w:lang w:bidi="fa-IR"/>
         </w:rPr>
         <w:pict w14:anchorId="2552C603">
-          <v:rect id="_x0000_i1122" style="width:0;height:1.5pt" o:hralign="center" o:hrstd="t" o:hr="t" fillcolor="#a0a0a0" stroked="f"/>
+          <v:rect id="_x0000_i1048" style="width:0;height:1.5pt" o:hralign="center" o:hrstd="t" o:hr="t" fillcolor="#a0a0a0" stroked="f"/>
         </w:pict>
       </w:r>
     </w:p>
@@ -6264,7 +6479,7 @@
           <w:lang w:bidi="fa-IR"/>
         </w:rPr>
         <w:pict w14:anchorId="640A5236">
-          <v:rect id="_x0000_i1193" style="width:0;height:1.5pt" o:hralign="center" o:hrstd="t" o:hr="t" fillcolor="#a0a0a0" stroked="f"/>
+          <v:rect id="_x0000_i1049" style="width:0;height:1.5pt" o:hralign="center" o:hrstd="t" o:hr="t" fillcolor="#a0a0a0" stroked="f"/>
         </w:pict>
       </w:r>
     </w:p>
@@ -6363,7 +6578,7 @@
           <w:lang w:bidi="fa-IR"/>
         </w:rPr>
         <w:pict w14:anchorId="7B00C0B3">
-          <v:rect id="_x0000_i1194" style="width:0;height:1.5pt" o:hralign="center" o:hrstd="t" o:hr="t" fillcolor="#a0a0a0" stroked="f"/>
+          <v:rect id="_x0000_i1050" style="width:0;height:1.5pt" o:hralign="center" o:hrstd="t" o:hr="t" fillcolor="#a0a0a0" stroked="f"/>
         </w:pict>
       </w:r>
     </w:p>
@@ -6504,7 +6719,7 @@
           <w:lang w:bidi="fa-IR"/>
         </w:rPr>
         <w:pict w14:anchorId="66ED801F">
-          <v:rect id="_x0000_i1195" style="width:0;height:1.5pt" o:hralign="center" o:hrstd="t" o:hr="t" fillcolor="#a0a0a0" stroked="f"/>
+          <v:rect id="_x0000_i1051" style="width:0;height:1.5pt" o:hralign="center" o:hrstd="t" o:hr="t" fillcolor="#a0a0a0" stroked="f"/>
         </w:pict>
       </w:r>
     </w:p>
@@ -6703,7 +6918,7 @@
           <w:lang w:bidi="fa-IR"/>
         </w:rPr>
         <w:pict w14:anchorId="40591115">
-          <v:rect id="_x0000_i1196" style="width:0;height:1.5pt" o:hralign="center" o:hrstd="t" o:hr="t" fillcolor="#a0a0a0" stroked="f"/>
+          <v:rect id="_x0000_i1052" style="width:0;height:1.5pt" o:hralign="center" o:hrstd="t" o:hr="t" fillcolor="#a0a0a0" stroked="f"/>
         </w:pict>
       </w:r>
     </w:p>
@@ -6832,7 +7047,7 @@
           <w:lang w:bidi="fa-IR"/>
         </w:rPr>
         <w:pict w14:anchorId="33F13B14">
-          <v:rect id="_x0000_i1197" style="width:0;height:1.5pt" o:hralign="center" o:hrstd="t" o:hr="t" fillcolor="#a0a0a0" stroked="f"/>
+          <v:rect id="_x0000_i1053" style="width:0;height:1.5pt" o:hralign="center" o:hrstd="t" o:hr="t" fillcolor="#a0a0a0" stroked="f"/>
         </w:pict>
       </w:r>
     </w:p>
@@ -6954,7 +7169,7 @@
           <w:lang w:bidi="fa-IR"/>
         </w:rPr>
         <w:pict w14:anchorId="4874500C">
-          <v:rect id="_x0000_i1198" style="width:0;height:1.5pt" o:hralign="center" o:hrstd="t" o:hr="t" fillcolor="#a0a0a0" stroked="f"/>
+          <v:rect id="_x0000_i1054" style="width:0;height:1.5pt" o:hralign="center" o:hrstd="t" o:hr="t" fillcolor="#a0a0a0" stroked="f"/>
         </w:pict>
       </w:r>
     </w:p>
@@ -7072,7 +7287,7 @@
           <w:lang w:bidi="fa-IR"/>
         </w:rPr>
         <w:pict w14:anchorId="312FB7C6">
-          <v:rect id="_x0000_i1199" style="width:0;height:1.5pt" o:hralign="center" o:hrstd="t" o:hr="t" fillcolor="#a0a0a0" stroked="f"/>
+          <v:rect id="_x0000_i1055" style="width:0;height:1.5pt" o:hralign="center" o:hrstd="t" o:hr="t" fillcolor="#a0a0a0" stroked="f"/>
         </w:pict>
       </w:r>
     </w:p>
@@ -7121,7 +7336,7 @@
           <w:lang w:bidi="fa-IR"/>
         </w:rPr>
         <w:pict w14:anchorId="0EA9F17D">
-          <v:rect id="_x0000_i1200" style="width:0;height:1.5pt" o:hralign="center" o:hrstd="t" o:hr="t" fillcolor="#a0a0a0" stroked="f"/>
+          <v:rect id="_x0000_i1056" style="width:0;height:1.5pt" o:hralign="center" o:hrstd="t" o:hr="t" fillcolor="#a0a0a0" stroked="f"/>
         </w:pict>
       </w:r>
     </w:p>
@@ -7213,7 +7428,7 @@
           <w:lang w:bidi="fa-IR"/>
         </w:rPr>
         <w:pict w14:anchorId="28A1F19F">
-          <v:rect id="_x0000_i1201" style="width:0;height:1.5pt" o:hralign="center" o:hrstd="t" o:hr="t" fillcolor="#a0a0a0" stroked="f"/>
+          <v:rect id="_x0000_i1057" style="width:0;height:1.5pt" o:hralign="center" o:hrstd="t" o:hr="t" fillcolor="#a0a0a0" stroked="f"/>
         </w:pict>
       </w:r>
     </w:p>
@@ -7355,7 +7570,7 @@
           <w:lang w:bidi="fa-IR"/>
         </w:rPr>
         <w:pict w14:anchorId="67BF36DA">
-          <v:rect id="_x0000_i1202" style="width:0;height:1.5pt" o:hralign="center" o:hrstd="t" o:hr="t" fillcolor="#a0a0a0" stroked="f"/>
+          <v:rect id="_x0000_i1058" style="width:0;height:1.5pt" o:hralign="center" o:hrstd="t" o:hr="t" fillcolor="#a0a0a0" stroked="f"/>
         </w:pict>
       </w:r>
     </w:p>
@@ -7668,7 +7883,6 @@
       <w:pPr>
         <w:bidi/>
         <w:rPr>
-          <w:rFonts w:hint="cs"/>
           <w:rtl/>
           <w:lang w:bidi="fa-IR"/>
         </w:rPr>

</xml_diff>